<commit_message>
Align individual lab reports with assignment-by-assignment structure and verify deliverables
</commit_message>
<xml_diff>
--- a/lab01_representations/report.docx
+++ b/lab01_representations/report.docx
@@ -283,7 +283,7 @@
       <w:r>
         <w:fldChar w:fldCharType="separate"/>
       </w:r>
-      <w:hyperlink w:anchor="_Toc239790555" w:history="1">
+      <w:hyperlink w:anchor="_Toc240532800" w:history="1">
         <w:r>
           <w:rPr>
             <w:rStyle w:val="aff8"/>
@@ -311,7 +311,7 @@
             <w:noProof/>
             <w:webHidden/>
           </w:rPr>
-          <w:instrText xml:space="preserve"> PAGEREF _Toc239790555 \h </w:instrText>
+          <w:instrText xml:space="preserve"> PAGEREF _Toc240532800 \h </w:instrText>
         </w:r>
         <w:r>
           <w:rPr>
@@ -356,14 +356,14 @@
           <w:lang w:val="ru-RU" w:eastAsia="ru-RU"/>
         </w:rPr>
       </w:pPr>
-      <w:hyperlink w:anchor="_Toc239790556" w:history="1">
+      <w:hyperlink w:anchor="_Toc240532801" w:history="1">
         <w:r>
           <w:rPr>
             <w:rStyle w:val="aff8"/>
             <w:rFonts w:eastAsiaTheme="majorEastAsia"/>
             <w:noProof/>
           </w:rPr>
-          <w:t>1 Выполнение работы</w:t>
+          <w:t>1 Задание</w:t>
         </w:r>
         <w:r>
           <w:rPr>
@@ -384,7 +384,7 @@
             <w:noProof/>
             <w:webHidden/>
           </w:rPr>
-          <w:instrText xml:space="preserve"> PAGEREF _Toc239790556 \h </w:instrText>
+          <w:instrText xml:space="preserve"> PAGEREF _Toc240532801 \h </w:instrText>
         </w:r>
         <w:r>
           <w:rPr>
@@ -417,7 +417,7 @@
     </w:p>
     <w:p>
       <w:pPr>
-        <w:pStyle w:val="2c"/>
+        <w:pStyle w:val="14"/>
         <w:tabs>
           <w:tab w:val="right" w:leader="dot" w:pos="9345"/>
         </w:tabs>
@@ -429,14 +429,14 @@
           <w:lang w:val="ru-RU" w:eastAsia="ru-RU"/>
         </w:rPr>
       </w:pPr>
-      <w:hyperlink w:anchor="_Toc239790557" w:history="1">
+      <w:hyperlink w:anchor="_Toc240532802" w:history="1">
         <w:r>
           <w:rPr>
             <w:rStyle w:val="aff8"/>
             <w:rFonts w:eastAsiaTheme="majorEastAsia"/>
             <w:noProof/>
           </w:rPr>
-          <w:t>1.1 Данные и предварительная проверка</w:t>
+          <w:t>2 Ход работы</w:t>
         </w:r>
         <w:r>
           <w:rPr>
@@ -457,7 +457,7 @@
             <w:noProof/>
             <w:webHidden/>
           </w:rPr>
-          <w:instrText xml:space="preserve"> PAGEREF _Toc239790557 \h </w:instrText>
+          <w:instrText xml:space="preserve"> PAGEREF _Toc240532802 \h </w:instrText>
         </w:r>
         <w:r>
           <w:rPr>
@@ -477,7 +477,7 @@
             <w:noProof/>
             <w:webHidden/>
           </w:rPr>
-          <w:t>4</w:t>
+          <w:t>5</w:t>
         </w:r>
         <w:r>
           <w:rPr>
@@ -502,14 +502,14 @@
           <w:lang w:val="ru-RU" w:eastAsia="ru-RU"/>
         </w:rPr>
       </w:pPr>
-      <w:hyperlink w:anchor="_Toc239790558" w:history="1">
+      <w:hyperlink w:anchor="_Toc240532803" w:history="1">
         <w:r>
           <w:rPr>
             <w:rStyle w:val="aff8"/>
             <w:rFonts w:eastAsiaTheme="majorEastAsia"/>
             <w:noProof/>
           </w:rPr>
-          <w:t>1.2 Методика</w:t>
+          <w:t>2.1 Задание 1. Данные и предварительная проверка</w:t>
         </w:r>
         <w:r>
           <w:rPr>
@@ -530,7 +530,7 @@
             <w:noProof/>
             <w:webHidden/>
           </w:rPr>
-          <w:instrText xml:space="preserve"> PAGEREF _Toc239790558 \h </w:instrText>
+          <w:instrText xml:space="preserve"> PAGEREF _Toc240532803 \h </w:instrText>
         </w:r>
         <w:r>
           <w:rPr>
@@ -550,7 +550,7 @@
             <w:noProof/>
             <w:webHidden/>
           </w:rPr>
-          <w:t>4</w:t>
+          <w:t>5</w:t>
         </w:r>
         <w:r>
           <w:rPr>
@@ -575,14 +575,14 @@
           <w:lang w:val="ru-RU" w:eastAsia="ru-RU"/>
         </w:rPr>
       </w:pPr>
-      <w:hyperlink w:anchor="_Toc239790559" w:history="1">
+      <w:hyperlink w:anchor="_Toc240532804" w:history="1">
         <w:r>
           <w:rPr>
             <w:rStyle w:val="aff8"/>
             <w:rFonts w:eastAsiaTheme="majorEastAsia"/>
             <w:noProof/>
           </w:rPr>
-          <w:t>1.3 Результаты девяти сравнений</w:t>
+          <w:t>2.2 Задание 2. Четыре представления текста</w:t>
         </w:r>
         <w:r>
           <w:rPr>
@@ -603,7 +603,80 @@
             <w:noProof/>
             <w:webHidden/>
           </w:rPr>
-          <w:instrText xml:space="preserve"> PAGEREF _Toc239790559 \h </w:instrText>
+          <w:instrText xml:space="preserve"> PAGEREF _Toc240532804 \h </w:instrText>
+        </w:r>
+        <w:r>
+          <w:rPr>
+            <w:noProof/>
+            <w:webHidden/>
+          </w:rPr>
+        </w:r>
+        <w:r>
+          <w:rPr>
+            <w:noProof/>
+            <w:webHidden/>
+          </w:rPr>
+          <w:fldChar w:fldCharType="separate"/>
+        </w:r>
+        <w:r>
+          <w:rPr>
+            <w:noProof/>
+            <w:webHidden/>
+          </w:rPr>
+          <w:t>5</w:t>
+        </w:r>
+        <w:r>
+          <w:rPr>
+            <w:noProof/>
+            <w:webHidden/>
+          </w:rPr>
+          <w:fldChar w:fldCharType="end"/>
+        </w:r>
+      </w:hyperlink>
+    </w:p>
+    <w:p>
+      <w:pPr>
+        <w:pStyle w:val="2c"/>
+        <w:tabs>
+          <w:tab w:val="right" w:leader="dot" w:pos="9345"/>
+        </w:tabs>
+        <w:rPr>
+          <w:rFonts w:asciiTheme="minorHAnsi" w:eastAsiaTheme="minorEastAsia" w:hAnsiTheme="minorHAnsi"/>
+          <w:noProof/>
+          <w:color w:val="auto"/>
+          <w:sz w:val="22"/>
+          <w:lang w:val="ru-RU" w:eastAsia="ru-RU"/>
+        </w:rPr>
+      </w:pPr>
+      <w:hyperlink w:anchor="_Toc240532805" w:history="1">
+        <w:r>
+          <w:rPr>
+            <w:rStyle w:val="aff8"/>
+            <w:rFonts w:eastAsiaTheme="majorEastAsia"/>
+            <w:noProof/>
+          </w:rPr>
+          <w:t>2.3 Задание 3 и 5. Преобразования и оценка смысла</w:t>
+        </w:r>
+        <w:r>
+          <w:rPr>
+            <w:noProof/>
+            <w:webHidden/>
+          </w:rPr>
+          <w:tab/>
+        </w:r>
+        <w:r>
+          <w:rPr>
+            <w:noProof/>
+            <w:webHidden/>
+          </w:rPr>
+          <w:fldChar w:fldCharType="begin"/>
+        </w:r>
+        <w:r>
+          <w:rPr>
+            <w:noProof/>
+            <w:webHidden/>
+          </w:rPr>
+          <w:instrText xml:space="preserve"> PAGEREF _Toc240532805 \h </w:instrText>
         </w:r>
         <w:r>
           <w:rPr>
@@ -648,14 +721,14 @@
           <w:lang w:val="ru-RU" w:eastAsia="ru-RU"/>
         </w:rPr>
       </w:pPr>
-      <w:hyperlink w:anchor="_Toc239790560" w:history="1">
+      <w:hyperlink w:anchor="_Toc240532806" w:history="1">
         <w:r>
           <w:rPr>
             <w:rStyle w:val="aff8"/>
             <w:rFonts w:eastAsiaTheme="majorEastAsia"/>
             <w:noProof/>
           </w:rPr>
-          <w:t>1.4 Три несоответствия близости и смысла</w:t>
+          <w:t>2.4 Задание 4. Косинусное сходство девяти пар</w:t>
         </w:r>
         <w:r>
           <w:rPr>
@@ -676,7 +749,7 @@
             <w:noProof/>
             <w:webHidden/>
           </w:rPr>
-          <w:instrText xml:space="preserve"> PAGEREF _Toc239790560 \h </w:instrText>
+          <w:instrText xml:space="preserve"> PAGEREF _Toc240532806 \h </w:instrText>
         </w:r>
         <w:r>
           <w:rPr>
@@ -709,7 +782,7 @@
     </w:p>
     <w:p>
       <w:pPr>
-        <w:pStyle w:val="14"/>
+        <w:pStyle w:val="2c"/>
         <w:tabs>
           <w:tab w:val="right" w:leader="dot" w:pos="9345"/>
         </w:tabs>
@@ -721,14 +794,14 @@
           <w:lang w:val="ru-RU" w:eastAsia="ru-RU"/>
         </w:rPr>
       </w:pPr>
-      <w:hyperlink w:anchor="_Toc239790561" w:history="1">
+      <w:hyperlink w:anchor="_Toc240532807" w:history="1">
         <w:r>
           <w:rPr>
             <w:rStyle w:val="aff8"/>
             <w:rFonts w:eastAsiaTheme="majorEastAsia"/>
             <w:noProof/>
           </w:rPr>
-          <w:t>ЗАКЛЮЧЕНИЕ</w:t>
+          <w:t>2.5 Задание 6. Несоответствия близости и смысла</w:t>
         </w:r>
         <w:r>
           <w:rPr>
@@ -749,7 +822,7 @@
             <w:noProof/>
             <w:webHidden/>
           </w:rPr>
-          <w:instrText xml:space="preserve"> PAGEREF _Toc239790561 \h </w:instrText>
+          <w:instrText xml:space="preserve"> PAGEREF _Toc240532807 \h </w:instrText>
         </w:r>
         <w:r>
           <w:rPr>
@@ -794,14 +867,14 @@
           <w:lang w:val="ru-RU" w:eastAsia="ru-RU"/>
         </w:rPr>
       </w:pPr>
-      <w:hyperlink w:anchor="_Toc239790562" w:history="1">
+      <w:hyperlink w:anchor="_Toc240532808" w:history="1">
         <w:r>
           <w:rPr>
             <w:rStyle w:val="aff8"/>
             <w:rFonts w:eastAsiaTheme="majorEastAsia"/>
             <w:noProof/>
           </w:rPr>
-          <w:t>СПИСОК ИСПОЛЬЗОВАННЫХ ИСТОЧНИКОВ</w:t>
+          <w:t>ЗАКЛЮЧЕНИЕ</w:t>
         </w:r>
         <w:r>
           <w:rPr>
@@ -822,7 +895,7 @@
             <w:noProof/>
             <w:webHidden/>
           </w:rPr>
-          <w:instrText xml:space="preserve"> PAGEREF _Toc239790562 \h </w:instrText>
+          <w:instrText xml:space="preserve"> PAGEREF _Toc240532808 \h </w:instrText>
         </w:r>
         <w:r>
           <w:rPr>
@@ -855,6 +928,79 @@
     </w:p>
     <w:p>
       <w:pPr>
+        <w:pStyle w:val="14"/>
+        <w:tabs>
+          <w:tab w:val="right" w:leader="dot" w:pos="9345"/>
+        </w:tabs>
+        <w:rPr>
+          <w:rFonts w:asciiTheme="minorHAnsi" w:eastAsiaTheme="minorEastAsia" w:hAnsiTheme="minorHAnsi"/>
+          <w:noProof/>
+          <w:color w:val="auto"/>
+          <w:sz w:val="22"/>
+          <w:lang w:val="ru-RU" w:eastAsia="ru-RU"/>
+        </w:rPr>
+      </w:pPr>
+      <w:hyperlink w:anchor="_Toc240532809" w:history="1">
+        <w:r>
+          <w:rPr>
+            <w:rStyle w:val="aff8"/>
+            <w:rFonts w:eastAsiaTheme="majorEastAsia"/>
+            <w:noProof/>
+          </w:rPr>
+          <w:t>СПИСОК ИСПОЛЬЗОВАННЫХ ИСТОЧНИКОВ</w:t>
+        </w:r>
+        <w:r>
+          <w:rPr>
+            <w:noProof/>
+            <w:webHidden/>
+          </w:rPr>
+          <w:tab/>
+        </w:r>
+        <w:r>
+          <w:rPr>
+            <w:noProof/>
+            <w:webHidden/>
+          </w:rPr>
+          <w:fldChar w:fldCharType="begin"/>
+        </w:r>
+        <w:r>
+          <w:rPr>
+            <w:noProof/>
+            <w:webHidden/>
+          </w:rPr>
+          <w:instrText xml:space="preserve"> PAGEREF _Toc240532809 \h </w:instrText>
+        </w:r>
+        <w:r>
+          <w:rPr>
+            <w:noProof/>
+            <w:webHidden/>
+          </w:rPr>
+        </w:r>
+        <w:r>
+          <w:rPr>
+            <w:noProof/>
+            <w:webHidden/>
+          </w:rPr>
+          <w:fldChar w:fldCharType="separate"/>
+        </w:r>
+        <w:r>
+          <w:rPr>
+            <w:noProof/>
+            <w:webHidden/>
+          </w:rPr>
+          <w:t>10</w:t>
+        </w:r>
+        <w:r>
+          <w:rPr>
+            <w:noProof/>
+            <w:webHidden/>
+          </w:rPr>
+          <w:fldChar w:fldCharType="end"/>
+        </w:r>
+      </w:hyperlink>
+    </w:p>
+    <w:p>
+      <w:pPr>
         <w:ind w:firstLine="0"/>
       </w:pPr>
       <w:r>
@@ -870,7 +1016,7 @@
         <w:ind w:firstLine="0"/>
         <w:jc w:val="center"/>
       </w:pPr>
-      <w:bookmarkStart w:id="1" w:name="_Toc239790555"/>
+      <w:bookmarkStart w:id="1" w:name="_Toc240532800"/>
       <w:r>
         <w:lastRenderedPageBreak/>
         <w:t>ВВЕДЕНИЕ</w:t>
@@ -896,12 +1042,63 @@
         <w:spacing w:after="240"/>
         <w:jc w:val="left"/>
       </w:pPr>
-      <w:bookmarkStart w:id="2" w:name="_Toc239790556"/>
+      <w:bookmarkStart w:id="2" w:name="_Toc240532801"/>
       <w:r>
         <w:lastRenderedPageBreak/>
-        <w:t>1 Выполнение работы</w:t>
+        <w:t>1 Задание</w:t>
       </w:r>
       <w:bookmarkEnd w:id="2"/>
+    </w:p>
+    <w:p>
+      <w:r>
+        <w:t xml:space="preserve">1. Загрузить 100–200 текстов </w:t>
+      </w:r>
+      <w:r>
+        <w:t>RuSentiment, проверить пропуски, дубликаты и длины.</w:t>
+      </w:r>
+    </w:p>
+    <w:p>
+      <w:r>
+        <w:t>2. Построить поверхностные признаки, bag-of-words, TF–IDF и sentence embeddings.</w:t>
+      </w:r>
+    </w:p>
+    <w:p>
+      <w:r>
+        <w:t>3. Для трёх текстов разных классов создать перестановку, парафраз и смысловое изменение.</w:t>
+      </w:r>
+    </w:p>
+    <w:p>
+      <w:r>
+        <w:t xml:space="preserve">4. Рассчитать косинусное сходство </w:t>
+      </w:r>
+      <w:r>
+        <w:t>девяти пар для BoW, TF–IDF и embeddings.</w:t>
+      </w:r>
+    </w:p>
+    <w:p>
+      <w:r>
+        <w:t>5. Вручную указать изменение смысла и обосновать семантические суждения.</w:t>
+      </w:r>
+    </w:p>
+    <w:p>
+      <w:r>
+        <w:t>6. Сопоставить представления и разобрать не менее трёх несоответствий численной близости и смысла.</w:t>
+      </w:r>
+    </w:p>
+    <w:p>
+      <w:pPr>
+        <w:pStyle w:val="1"/>
+        <w:keepNext/>
+        <w:pageBreakBefore/>
+        <w:spacing w:after="240"/>
+        <w:jc w:val="left"/>
+      </w:pPr>
+      <w:bookmarkStart w:id="3" w:name="_Toc240532802"/>
+      <w:r>
+        <w:lastRenderedPageBreak/>
+        <w:t>2 Ход работы</w:t>
+      </w:r>
+      <w:bookmarkEnd w:id="3"/>
     </w:p>
     <w:p>
       <w:pPr>
@@ -910,32 +1107,32 @@
         <w:spacing w:before="240" w:after="240"/>
         <w:jc w:val="left"/>
       </w:pPr>
-      <w:bookmarkStart w:id="3" w:name="_Toc239790557"/>
+      <w:bookmarkStart w:id="4" w:name="_Toc240532803"/>
       <w:r>
-        <w:t xml:space="preserve">1.1 Данные и предварительная </w:t>
+        <w:t>2.1 Задание 1. Данные и предва</w:t>
       </w:r>
       <w:r>
-        <w:t>проверка</w:t>
+        <w:t>рительная проверка</w:t>
       </w:r>
-      <w:bookmarkEnd w:id="3"/>
+      <w:bookmarkEnd w:id="4"/>
     </w:p>
     <w:p>
       <w:r>
-        <w:t>Я использовал 150 сообщений RuSentiment [1]. Основной репозиторий больше не распространяет корпус, поэтому данные получены из публичного форка strawberrypie/rusentiment. Ссылка, контрольная сумма исходного файла и процедура отбора сохранены. Выбор</w:t>
+        <w:t>Я использовал 150 сообщений RuSentiment [1]. Основной репозиторий больше не распространяет корпус, поэтому данные получены из публичного форка strawberrypie/rusentiment. Ссылка, контрольная сумма исходного файла и процедура отбора сохран</w:t>
       </w:r>
       <w:r>
-        <w:t>ка взята из обучающей части общей подготовки с random_state=42; оставлены positive, negative и neutral. Классы speech и skip исключены. Это трёхклассовый учебный срез, а не воспроизведение исходной пяти-классовой задачи статьи.</w:t>
+        <w:t>ены. Выборка взята из обучающей части общей подготовки с random_state=42; оставлены positive, negative и neutral. Классы speech и skip исключены. Это трёхклассовый учебный срез, а не воспроизведение исходной пяти-классовой задачи статьи.</w:t>
       </w:r>
     </w:p>
     <w:p>
       <w:r>
-        <w:t>В выборке 82 нейтральных, 46</w:t>
+        <w:t>В выборке 82 нейтр</w:t>
       </w:r>
       <w:r>
-        <w:t xml:space="preserve"> положительных и 22 отрицательных сообщения. Пропусков и повторяющихся текстов после подготовки нет. В полном исходном файле случайных сообщений обнаружено 74 дубликата; удаление выполнено до отбора. Средняя длина равна 69,81 символа, медиана — 40,5, макси</w:t>
+        <w:t>альных, 46 положительных и 22 отрицательных сообщения. Пропусков и повторяющихся текстов после подготовки нет. В полном исходном файле случайных сообщений обнаружено 74 дубликата; удаление выполнено до отбора. Средняя длина равна 69,81 символа, медиана — 4</w:t>
       </w:r>
       <w:r>
-        <w:t>мум — 789. Для токенов razdel среднее составляет 14,47, медиана — 9, максимум — 154. Разница среднего и медианы отражает длинный правый хвост: небольшое число длинных сообщений заметно влияет на среднее.</w:t>
+        <w:t>0,5, максимум — 789. Для токенов razdel среднее составляет 14,47, медиана — 9, максимум — 154. Разница среднего и медианы отражает длинный правый хвост: небольшое число длинных сообщений заметно влияет на среднее.</w:t>
       </w:r>
     </w:p>
     <w:p>
@@ -1001,14 +1198,14 @@
         <w:spacing w:before="240" w:after="240"/>
         <w:jc w:val="left"/>
       </w:pPr>
-      <w:bookmarkStart w:id="4" w:name="_Toc239790558"/>
+      <w:bookmarkStart w:id="5" w:name="_Toc240532804"/>
       <w:r>
-        <w:t>1.2 Методик</w:t>
+        <w:t>2</w:t>
       </w:r>
       <w:r>
-        <w:t>а</w:t>
+        <w:t>.2 Задание 2. Четыре представления текста</w:t>
       </w:r>
-      <w:bookmarkEnd w:id="4"/>
+      <w:bookmarkEnd w:id="5"/>
     </w:p>
     <w:p>
       <w:r>
@@ -1016,43 +1213,32 @@
       </w:r>
       <w:r>
         <w:lastRenderedPageBreak/>
-        <w:t xml:space="preserve">заглавных букв среди букв. Такие признаки описывают форму сообщения и могут отражать эмоциональную подачу, но не указывают, </w:t>
+        <w:t>заглавных букв среди букв. Такие признаки описывают форму сообщения и могут отражать</w:t>
       </w:r>
       <w:r>
-        <w:t>о чём именно говорит автор. Например, два противоположных утверждения способны иметь почти одинаковую длину и пунктуацию. Все признаки сохранены построчно с исходными идентификаторами.</w:t>
+        <w:t xml:space="preserve"> эмоциональную подачу, но не указывают, о чём именно говорит автор. Например, два противоположных утверждения способны иметь почти одинаковую длину и пунктуацию. Все признаки сохранены построчно с исходными идентификаторами.</w:t>
       </w:r>
     </w:p>
     <w:p>
       <w:r>
-        <w:t>Для bag-of-words и TF–IDF я использовал CountVectorizer и TfidfVectoriz</w:t>
+        <w:t>Для bag-of-words и TF–IDF я исп</w:t>
       </w:r>
       <w:r>
-        <w:t>er. Токенизация выполняется razdel, регистр понижается, чистая пунктуация исключается. Лемматизация и удаление стоп-слов не применяются: важно сохранить отрицание «не». Словарь и IDF обучаются только на 150 исходных текстах. Изменённые варианты преобразуют</w:t>
+        <w:t xml:space="preserve">ользовал CountVectorizer и TfidfVectorizer. Токенизация выполняется razdel, регистр понижается, чистая пунктуация исключается. Лемматизация и удаление стоп-слов не применяются: важно сохранить отрицание «не». Словарь и IDF обучаются только на 150 исходных </w:t>
       </w:r>
       <w:r>
-        <w:t>ся уже готовыми векторизаторами. Поэтому эксперимент также выявляет проблему неизвестных слов; доля OOV сохранена отдельно для каждой пары.</w:t>
+        <w:t>текстах. Изменённые варианты преобразуются уже готовыми векторизаторами. Поэтому эксперимент также выявляет проблему неизвестных слов; доля OOV сохранена отдельно для каждой пары.</w:t>
       </w:r>
     </w:p>
     <w:p>
       <w:r>
-        <w:t>Плотное представление строится sentence-transformers с multilingual-e5-small [2]. Для симметричного сравнения обе ст</w:t>
+        <w:t>Плотное представление строится sentence-transformers с multilingual-e5-small</w:t>
       </w:r>
       <w:r>
-        <w:t>ороны получают одинаковый префикс query:, векторы нормируются. Я вычислил эмбеддинги на CPU, поэтому запуск работы не требует свободной видеокарты. Размерность и параметры модели записаны в embedding_config.json. Для каждого преобразования я рассчитал коси</w:t>
+        <w:t xml:space="preserve"> [2]. Для симметричного сравнения обе стороны получают одинаковый префикс query:, векторы нормируются. Я вычислил эмбеддинги на CPU, поэтому запуск работы не требует свободной видеокарты. Размерность и параметры модели записаны в embedding_config.json. Для</w:t>
       </w:r>
       <w:r>
-        <w:t>нусное сходство с оригиналом; всего получено девять пар. Поверхностные признаки не включены в косинусное сравнение: задание требует его для трёх остальных представлений.</w:t>
-      </w:r>
-    </w:p>
-    <w:p>
-      <w:r>
-        <w:t>Я выбрал оригиналы трёх классов: положительное сообщение о спокойной песне, отрицатель</w:t>
-      </w:r>
-      <w:r>
-        <w:t>ное сообщение о глупых репостах и нейтральный вопрос о времени выезда. При конструировании преобразований я заранее сформулировал семантические решения и обоснования, чтобы затем сопоставить их с численным сходством. Для парафраза вопроса сохраняется основ</w:t>
-      </w:r>
-      <w:r>
-        <w:t>ное содержание, хотя эмоциональный оттенок обращения немного ослабляется.</w:t>
+        <w:t xml:space="preserve"> каждого преобразования я рассчитал косинусное сходство с оригиналом; всего получено девять пар. Поверхностные признаки не включены в косинусное сравнение: задание требует его для трёх остальных представлений.</w:t>
       </w:r>
     </w:p>
     <w:p>
@@ -1062,12 +1248,44 @@
         <w:spacing w:before="240" w:after="240"/>
         <w:jc w:val="left"/>
       </w:pPr>
-      <w:bookmarkStart w:id="5" w:name="_Toc239790559"/>
+      <w:bookmarkStart w:id="6" w:name="_Toc240532805"/>
+      <w:r>
+        <w:t>2.3 Задание 3 и 5. Преобразования и оценка смы</w:t>
+      </w:r>
+      <w:r>
+        <w:t>сла</w:t>
+      </w:r>
+      <w:bookmarkEnd w:id="6"/>
+    </w:p>
+    <w:p>
+      <w:r>
+        <w:t>Я выбрал оригиналы трёх классов: положительное сообщение о спокойной песне, отрицательное сообщение о глупых репостах и нейтральный вопрос о времени выезда. При конструировании преобразований заранее зафиксированы семантические решения и обоснования дл</w:t>
+      </w:r>
+      <w:r>
+        <w:t>я сопоставления с численным сходством. Для парафраза вопроса сохраняется основное содержание, хотя эмоциональный оттенок обращения немного ослабляется.</w:t>
+      </w:r>
+    </w:p>
+    <w:p>
       <w:r>
         <w:lastRenderedPageBreak/>
-        <w:t>1.3 Результаты девяти сравнений</w:t>
+        <w:t>В сохранённом CSV поле reviewer указывает, что исходные семантические суждения подготовлены ИИ-ассистент</w:t>
       </w:r>
-      <w:bookmarkEnd w:id="5"/>
+      <w:r>
+        <w:t>ом. Личная ручная проверка девяти пар, требуемая заданием, этими записями не подтверждается.</w:t>
+      </w:r>
+    </w:p>
+    <w:p>
+      <w:pPr>
+        <w:pStyle w:val="21"/>
+        <w:keepNext/>
+        <w:spacing w:before="240" w:after="240"/>
+        <w:jc w:val="left"/>
+      </w:pPr>
+      <w:bookmarkStart w:id="7" w:name="_Toc240532806"/>
+      <w:r>
+        <w:t>2.4 Задание 4. Косинусное сходство девяти пар</w:t>
+      </w:r>
+      <w:bookmarkEnd w:id="7"/>
     </w:p>
     <w:p>
       <w:pPr>
@@ -1928,17 +2146,14 @@
     </w:p>
     <w:p>
       <w:r>
-        <w:t>Перестановка не меняет unigram-счётчики, поэтому обе разреженные модели возвращают ровно единицу. Этот результат следует из определения представления, а не доказывае</w:t>
+        <w:lastRenderedPageBreak/>
+        <w:t xml:space="preserve">Перестановка не меняет unigram-счётчики, поэтому обе разреженные модели возвращают ровно единицу. Этот результат следует из </w:t>
       </w:r>
       <w:r>
-        <w:t xml:space="preserve">т языковое понимание. Эмбеддинги немного меняются, поскольку модель чувствительна к последовательности. Для </w:t>
+        <w:t xml:space="preserve">определения представления, а не доказывает языковое понимание. Эмбеддинги немного меняются, поскольку модель чувствительна к последовательности. Для парафразов плотное представление существенно лучше сохраняет близость: значения 0,892–0,930 против 0–0,577 </w:t>
       </w:r>
       <w:r>
-        <w:lastRenderedPageBreak/>
-        <w:t>парафразов плотное представление существенно лучше сохраняет близость: значения 0,892–0,930 против 0–0,577 у разреженных методов. Однако часть паден</w:t>
-      </w:r>
-      <w:r>
-        <w:t>ия BoW объясняется малым словарём и морфологическими различиями, а не только заменой смысла.</w:t>
+        <w:t>у разреженных методов. Однако часть падения BoW объясняется малым словарём и морфологическими различиями, а не только заменой смысла.</w:t>
       </w:r>
     </w:p>
     <w:p>
@@ -1948,40 +2163,40 @@
         <w:spacing w:before="240" w:after="240"/>
         <w:jc w:val="left"/>
       </w:pPr>
-      <w:bookmarkStart w:id="6" w:name="_Toc239790560"/>
+      <w:bookmarkStart w:id="8" w:name="_Toc240532807"/>
       <w:r>
-        <w:t>1.4 Три несоответствия близости и смысла</w:t>
+        <w:t>2.5 Задание 6. Несоответствия близости и смысла</w:t>
       </w:r>
-      <w:bookmarkEnd w:id="6"/>
+      <w:bookmarkEnd w:id="8"/>
     </w:p>
     <w:p>
       <w:r>
-        <w:t xml:space="preserve">Первый случай: «Обожаю её» заменено на «Не обожаю её». Утверждение о восхищении отрицается, но TF–IDF даёт 0,974 и E5 — </w:t>
+        <w:t>Первый случай: «Обожаю её» заменено на «Не обожаю её». Утверждение о восхи</w:t>
       </w:r>
       <w:r>
-        <w:t>0,974. Почти весь словарь и тема песни сохранены; частое короткое отрицание мало меняет направление вектора. При этом новая фраза не обязательно означает ненависть: корректный вывод ограничен отсутствием прежнего утверждения.</w:t>
+        <w:t>щении отрицается, но TF–IDF даёт 0,974 и E5 — 0,974. Почти весь словарь и тема песни сохранены; частое короткое отрицание мало меняет направление вектора. При этом новая фраза не обязательно означает ненависть: корректный вывод ограничен отсутствием прежне</w:t>
+      </w:r>
+      <w:r>
+        <w:t>го утверждения.</w:t>
       </w:r>
     </w:p>
     <w:p>
       <w:r>
-        <w:t>Второй случай: «у тебя одни гл</w:t>
+        <w:t>Второй случай: «у тебя одни глупые репосты» превращается в «у тебя не одни глупые репосты». Меняется область отрицания и всеобщность оценки: допускаются другие публикации. BoW остаётся равным 0,943, TF–IDF — 0,979, E5 — 0,987. Плотная модел</w:t>
       </w:r>
       <w:r>
-        <w:t>упые репосты» превращается в «у тебя не одни глупые репосты». Меняется область отрицания и всеобщность оценки: допускаются другие публикации. BoW остаётся равным 0,943, TF–IDF — 0,979, E5 — 0,987. Плотная модель в этой паре даже менее чувствительна, чем пр</w:t>
-      </w:r>
-      <w:r>
-        <w:t>остое счётное представление. Тематическая близость не позволяет восстановить логический квантор.</w:t>
+        <w:t>ь в этой паре даже менее чувствительна, чем простое счётное представление. Тематическая близость не позволяет восстановить логический квантор.</w:t>
       </w:r>
     </w:p>
     <w:p>
       <w:r>
-        <w:t>Третий случай: «Когда выезжаешь» заменено на «Когда приезжаешь». Оба сообщения относятся к поездке, но запрашивают разные события и обычно разные моменты време</w:t>
+        <w:t>Третий случай: «Когда выезжаешь» заменено на «Когда приезжаешь». Оба сообщения относятся к поездке, но запрашиваю</w:t>
       </w:r>
       <w:r>
-        <w:t>ни. E5 показывает 0,988 — больше, чем для смыслосохраняющего парафраза этого же вопроса. Разреженные методы замечают замену слова сильнее, однако сами не объясняют различие выезда и прибытия. Следовательно, универсальный порог сходства не решает задачу экв</w:t>
+        <w:t>т разные события и обычно разные моменты времени. E5 показывает 0,988 — больше, чем для смыслосохраняющего парафраза этого же вопроса. Разреженные методы замечают замену слова сильнее, однако сами не объясняют различие выезда и прибытия. Следовательно, уни</w:t>
       </w:r>
       <w:r>
-        <w:t>ивалентности.</w:t>
+        <w:t>версальный порог сходства не решает задачу эквивалентности.</w:t>
       </w:r>
     </w:p>
     <w:p>
@@ -1993,22 +2208,22 @@
         <w:ind w:firstLine="0"/>
         <w:jc w:val="center"/>
       </w:pPr>
-      <w:bookmarkStart w:id="7" w:name="_Toc239790561"/>
+      <w:bookmarkStart w:id="9" w:name="_Toc240532808"/>
       <w:r>
         <w:lastRenderedPageBreak/>
         <w:t>ЗАКЛЮЧЕНИЕ</w:t>
       </w:r>
-      <w:bookmarkEnd w:id="7"/>
+      <w:bookmarkEnd w:id="9"/>
     </w:p>
     <w:p>
       <w:r>
-        <w:t>Поверхностные признаки сохраняют форму, BoW — лексический состав, TF–IDF — взвешенный лексический состав, E5 — более широкую тематическую и семантическую близость. Плотные векторы полезнее для перефразирования, но могут игнорироват</w:t>
+        <w:t>Поверхностные признаки сохраняют форму, BoW — лексический состав, TF–IDF — взвешенный лексический состав, E5 — более широкую тематическую и семантическую близость. Плотные векторы полез</w:t>
       </w:r>
       <w:r>
-        <w:t>ь отрицание и замену события. Девять специально выбранных пар иллюстрируют механизм ошибки, а не оценивают её частоту в языке. Для задач, где важны противоположные утверждения, после поиска похожих текстов необходима отдельная проверка содержания. Я послед</w:t>
+        <w:t>нее для перефразирования, но могут игнорировать отрицание и замену события. Девять специально выбранных пар иллюстрируют механизм ошибки, а не оценивают её частоту в языке. Для задач, где важны противоположные утверждения, после поиска похожих текстов необ</w:t>
       </w:r>
       <w:r>
-        <w:t>овательно выполнил notebook; исходные данные, преобразования, матрицы, графики и таблицы сохранены для повторного запуска.</w:t>
+        <w:t>ходима отдельная проверка содержания. Я последовательно выполнил notebook; исходные данные, преобразования, матрицы, графики и таблицы сохранены для повторного запуска.</w:t>
       </w:r>
     </w:p>
     <w:p>
@@ -2020,27 +2235,27 @@
         <w:ind w:firstLine="0"/>
         <w:jc w:val="center"/>
       </w:pPr>
-      <w:bookmarkStart w:id="8" w:name="_Toc239790562"/>
+      <w:bookmarkStart w:id="10" w:name="_Toc240532809"/>
       <w:r>
         <w:lastRenderedPageBreak/>
         <w:t>СПИСОК ИСПОЛЬЗОВАННЫХ ИСТОЧНИКОВ</w:t>
       </w:r>
-      <w:bookmarkEnd w:id="8"/>
+      <w:bookmarkEnd w:id="10"/>
     </w:p>
     <w:p>
       <w:r>
-        <w:t>[1] Rogers A. et al. RuSentiment: An Enriched Sentiment Analysis Dataset for Social Media in Russian</w:t>
+        <w:t>[1] Rogers A. et al. RuSentiment: An Enriched Sentimen</w:t>
       </w:r>
       <w:r>
-        <w:t>. COLING, 2018. URL: https://aclanthology.org/C18-1064/ (дата обращения: 08.09.2026). Данные: https://github.com/strawberrypie/rusentiment.</w:t>
+        <w:t>t Analysis Dataset for Social Media in Russian. COLING, 2018. URL: https://aclanthology.org/C18-1064/ (дата обращения: 08.09.2026). Данные: https://github.com/strawberrypie/rusentiment.</w:t>
       </w:r>
     </w:p>
     <w:p>
       <w:r>
-        <w:t>[2] intfloat. Multilingual E5 small: model card. URL: https://huggingface.co/intfloat/multilingual-e5-small (дата об</w:t>
+        <w:t>[2] intfloat. Multilingual E5 small: model card. URL: https://huggingf</w:t>
       </w:r>
       <w:r>
-        <w:t>ращения: 08.09.2026).</w:t>
+        <w:t>ace.co/intfloat/multilingual-e5-small (дата обращения: 08.09.2026).</w:t>
       </w:r>
     </w:p>
     <w:sectPr>
@@ -14100,7 +14315,7 @@
 </file>
 
 <file path=customXml/itemProps1.xml><?xml version="1.0" encoding="utf-8"?>
-<ds:datastoreItem xmlns:ds="http://schemas.openxmlformats.org/officeDocument/2006/customXml" ds:itemID="{E1AB556A-BC05-403F-9153-25400C5BA8A9}">
+<ds:datastoreItem xmlns:ds="http://schemas.openxmlformats.org/officeDocument/2006/customXml" ds:itemID="{99CFBD29-6C9A-46CE-A9DE-8EAE6BEB3DF8}">
   <ds:schemaRefs>
     <ds:schemaRef ds:uri="http://schemas.openxmlformats.org/officeDocument/2006/bibliography"/>
   </ds:schemaRefs>

</xml_diff>

<commit_message>
Record student confirmation of lab 1 semantic judgments
</commit_message>
<xml_diff>
--- a/lab01_representations/report.docx
+++ b/lab01_representations/report.docx
@@ -283,7 +283,7 @@
       <w:r>
         <w:fldChar w:fldCharType="separate"/>
       </w:r>
-      <w:hyperlink w:anchor="_Toc240532800" w:history="1">
+      <w:hyperlink w:anchor="_Toc240538592" w:history="1">
         <w:r>
           <w:rPr>
             <w:rStyle w:val="aff8"/>
@@ -311,7 +311,7 @@
             <w:noProof/>
             <w:webHidden/>
           </w:rPr>
-          <w:instrText xml:space="preserve"> PAGEREF _Toc240532800 \h </w:instrText>
+          <w:instrText xml:space="preserve"> PAGEREF _Toc240538592 \h </w:instrText>
         </w:r>
         <w:r>
           <w:rPr>
@@ -356,7 +356,7 @@
           <w:lang w:val="ru-RU" w:eastAsia="ru-RU"/>
         </w:rPr>
       </w:pPr>
-      <w:hyperlink w:anchor="_Toc240532801" w:history="1">
+      <w:hyperlink w:anchor="_Toc240538593" w:history="1">
         <w:r>
           <w:rPr>
             <w:rStyle w:val="aff8"/>
@@ -384,7 +384,7 @@
             <w:noProof/>
             <w:webHidden/>
           </w:rPr>
-          <w:instrText xml:space="preserve"> PAGEREF _Toc240532801 \h </w:instrText>
+          <w:instrText xml:space="preserve"> PAGEREF _Toc240538593 \h </w:instrText>
         </w:r>
         <w:r>
           <w:rPr>
@@ -429,7 +429,7 @@
           <w:lang w:val="ru-RU" w:eastAsia="ru-RU"/>
         </w:rPr>
       </w:pPr>
-      <w:hyperlink w:anchor="_Toc240532802" w:history="1">
+      <w:hyperlink w:anchor="_Toc240538594" w:history="1">
         <w:r>
           <w:rPr>
             <w:rStyle w:val="aff8"/>
@@ -457,7 +457,7 @@
             <w:noProof/>
             <w:webHidden/>
           </w:rPr>
-          <w:instrText xml:space="preserve"> PAGEREF _Toc240532802 \h </w:instrText>
+          <w:instrText xml:space="preserve"> PAGEREF _Toc240538594 \h </w:instrText>
         </w:r>
         <w:r>
           <w:rPr>
@@ -502,7 +502,7 @@
           <w:lang w:val="ru-RU" w:eastAsia="ru-RU"/>
         </w:rPr>
       </w:pPr>
-      <w:hyperlink w:anchor="_Toc240532803" w:history="1">
+      <w:hyperlink w:anchor="_Toc240538595" w:history="1">
         <w:r>
           <w:rPr>
             <w:rStyle w:val="aff8"/>
@@ -530,7 +530,7 @@
             <w:noProof/>
             <w:webHidden/>
           </w:rPr>
-          <w:instrText xml:space="preserve"> PAGEREF _Toc240532803 \h </w:instrText>
+          <w:instrText xml:space="preserve"> PAGEREF _Toc240538595 \h </w:instrText>
         </w:r>
         <w:r>
           <w:rPr>
@@ -575,7 +575,7 @@
           <w:lang w:val="ru-RU" w:eastAsia="ru-RU"/>
         </w:rPr>
       </w:pPr>
-      <w:hyperlink w:anchor="_Toc240532804" w:history="1">
+      <w:hyperlink w:anchor="_Toc240538596" w:history="1">
         <w:r>
           <w:rPr>
             <w:rStyle w:val="aff8"/>
@@ -603,7 +603,7 @@
             <w:noProof/>
             <w:webHidden/>
           </w:rPr>
-          <w:instrText xml:space="preserve"> PAGEREF _Toc240532804 \h </w:instrText>
+          <w:instrText xml:space="preserve"> PAGEREF _Toc240538596 \h </w:instrText>
         </w:r>
         <w:r>
           <w:rPr>
@@ -648,7 +648,7 @@
           <w:lang w:val="ru-RU" w:eastAsia="ru-RU"/>
         </w:rPr>
       </w:pPr>
-      <w:hyperlink w:anchor="_Toc240532805" w:history="1">
+      <w:hyperlink w:anchor="_Toc240538597" w:history="1">
         <w:r>
           <w:rPr>
             <w:rStyle w:val="aff8"/>
@@ -676,7 +676,7 @@
             <w:noProof/>
             <w:webHidden/>
           </w:rPr>
-          <w:instrText xml:space="preserve"> PAGEREF _Toc240532805 \h </w:instrText>
+          <w:instrText xml:space="preserve"> PAGEREF _Toc240538597 \h </w:instrText>
         </w:r>
         <w:r>
           <w:rPr>
@@ -721,7 +721,7 @@
           <w:lang w:val="ru-RU" w:eastAsia="ru-RU"/>
         </w:rPr>
       </w:pPr>
-      <w:hyperlink w:anchor="_Toc240532806" w:history="1">
+      <w:hyperlink w:anchor="_Toc240538598" w:history="1">
         <w:r>
           <w:rPr>
             <w:rStyle w:val="aff8"/>
@@ -749,7 +749,7 @@
             <w:noProof/>
             <w:webHidden/>
           </w:rPr>
-          <w:instrText xml:space="preserve"> PAGEREF _Toc240532806 \h </w:instrText>
+          <w:instrText xml:space="preserve"> PAGEREF _Toc240538598 \h </w:instrText>
         </w:r>
         <w:r>
           <w:rPr>
@@ -794,7 +794,7 @@
           <w:lang w:val="ru-RU" w:eastAsia="ru-RU"/>
         </w:rPr>
       </w:pPr>
-      <w:hyperlink w:anchor="_Toc240532807" w:history="1">
+      <w:hyperlink w:anchor="_Toc240538599" w:history="1">
         <w:r>
           <w:rPr>
             <w:rStyle w:val="aff8"/>
@@ -822,7 +822,7 @@
             <w:noProof/>
             <w:webHidden/>
           </w:rPr>
-          <w:instrText xml:space="preserve"> PAGEREF _Toc240532807 \h </w:instrText>
+          <w:instrText xml:space="preserve"> PAGEREF _Toc240538599 \h </w:instrText>
         </w:r>
         <w:r>
           <w:rPr>
@@ -867,7 +867,7 @@
           <w:lang w:val="ru-RU" w:eastAsia="ru-RU"/>
         </w:rPr>
       </w:pPr>
-      <w:hyperlink w:anchor="_Toc240532808" w:history="1">
+      <w:hyperlink w:anchor="_Toc240538600" w:history="1">
         <w:r>
           <w:rPr>
             <w:rStyle w:val="aff8"/>
@@ -895,80 +895,7 @@
             <w:noProof/>
             <w:webHidden/>
           </w:rPr>
-          <w:instrText xml:space="preserve"> PAGEREF _Toc240532808 \h </w:instrText>
-        </w:r>
-        <w:r>
-          <w:rPr>
-            <w:noProof/>
-            <w:webHidden/>
-          </w:rPr>
-        </w:r>
-        <w:r>
-          <w:rPr>
-            <w:noProof/>
-            <w:webHidden/>
-          </w:rPr>
-          <w:fldChar w:fldCharType="separate"/>
-        </w:r>
-        <w:r>
-          <w:rPr>
-            <w:noProof/>
-            <w:webHidden/>
-          </w:rPr>
-          <w:t>9</w:t>
-        </w:r>
-        <w:r>
-          <w:rPr>
-            <w:noProof/>
-            <w:webHidden/>
-          </w:rPr>
-          <w:fldChar w:fldCharType="end"/>
-        </w:r>
-      </w:hyperlink>
-    </w:p>
-    <w:p>
-      <w:pPr>
-        <w:pStyle w:val="14"/>
-        <w:tabs>
-          <w:tab w:val="right" w:leader="dot" w:pos="9345"/>
-        </w:tabs>
-        <w:rPr>
-          <w:rFonts w:asciiTheme="minorHAnsi" w:eastAsiaTheme="minorEastAsia" w:hAnsiTheme="minorHAnsi"/>
-          <w:noProof/>
-          <w:color w:val="auto"/>
-          <w:sz w:val="22"/>
-          <w:lang w:val="ru-RU" w:eastAsia="ru-RU"/>
-        </w:rPr>
-      </w:pPr>
-      <w:hyperlink w:anchor="_Toc240532809" w:history="1">
-        <w:r>
-          <w:rPr>
-            <w:rStyle w:val="aff8"/>
-            <w:rFonts w:eastAsiaTheme="majorEastAsia"/>
-            <w:noProof/>
-          </w:rPr>
-          <w:t>СПИСОК ИСПОЛЬЗОВАННЫХ ИСТОЧНИКОВ</w:t>
-        </w:r>
-        <w:r>
-          <w:rPr>
-            <w:noProof/>
-            <w:webHidden/>
-          </w:rPr>
-          <w:tab/>
-        </w:r>
-        <w:r>
-          <w:rPr>
-            <w:noProof/>
-            <w:webHidden/>
-          </w:rPr>
-          <w:fldChar w:fldCharType="begin"/>
-        </w:r>
-        <w:r>
-          <w:rPr>
-            <w:noProof/>
-            <w:webHidden/>
-          </w:rPr>
-          <w:instrText xml:space="preserve"> PAGEREF _Toc240532809 \h </w:instrText>
+          <w:instrText xml:space="preserve"> PAGEREF _Toc240538600 \h </w:instrText>
         </w:r>
         <w:r>
           <w:rPr>
@@ -1001,6 +928,79 @@
     </w:p>
     <w:p>
       <w:pPr>
+        <w:pStyle w:val="14"/>
+        <w:tabs>
+          <w:tab w:val="right" w:leader="dot" w:pos="9345"/>
+        </w:tabs>
+        <w:rPr>
+          <w:rFonts w:asciiTheme="minorHAnsi" w:eastAsiaTheme="minorEastAsia" w:hAnsiTheme="minorHAnsi"/>
+          <w:noProof/>
+          <w:color w:val="auto"/>
+          <w:sz w:val="22"/>
+          <w:lang w:val="ru-RU" w:eastAsia="ru-RU"/>
+        </w:rPr>
+      </w:pPr>
+      <w:hyperlink w:anchor="_Toc240538601" w:history="1">
+        <w:r>
+          <w:rPr>
+            <w:rStyle w:val="aff8"/>
+            <w:rFonts w:eastAsiaTheme="majorEastAsia"/>
+            <w:noProof/>
+          </w:rPr>
+          <w:t>СПИСОК ИСПОЛЬЗОВАННЫХ ИСТОЧНИКОВ</w:t>
+        </w:r>
+        <w:r>
+          <w:rPr>
+            <w:noProof/>
+            <w:webHidden/>
+          </w:rPr>
+          <w:tab/>
+        </w:r>
+        <w:r>
+          <w:rPr>
+            <w:noProof/>
+            <w:webHidden/>
+          </w:rPr>
+          <w:fldChar w:fldCharType="begin"/>
+        </w:r>
+        <w:r>
+          <w:rPr>
+            <w:noProof/>
+            <w:webHidden/>
+          </w:rPr>
+          <w:instrText xml:space="preserve"> PAGEREF _Toc240538601 \h </w:instrText>
+        </w:r>
+        <w:r>
+          <w:rPr>
+            <w:noProof/>
+            <w:webHidden/>
+          </w:rPr>
+        </w:r>
+        <w:r>
+          <w:rPr>
+            <w:noProof/>
+            <w:webHidden/>
+          </w:rPr>
+          <w:fldChar w:fldCharType="separate"/>
+        </w:r>
+        <w:r>
+          <w:rPr>
+            <w:noProof/>
+            <w:webHidden/>
+          </w:rPr>
+          <w:t>11</w:t>
+        </w:r>
+        <w:r>
+          <w:rPr>
+            <w:noProof/>
+            <w:webHidden/>
+          </w:rPr>
+          <w:fldChar w:fldCharType="end"/>
+        </w:r>
+      </w:hyperlink>
+    </w:p>
+    <w:p>
+      <w:pPr>
         <w:ind w:firstLine="0"/>
       </w:pPr>
       <w:r>
@@ -1016,7 +1016,7 @@
         <w:ind w:firstLine="0"/>
         <w:jc w:val="center"/>
       </w:pPr>
-      <w:bookmarkStart w:id="1" w:name="_Toc240532800"/>
+      <w:bookmarkStart w:id="1" w:name="_Toc240538592"/>
       <w:r>
         <w:lastRenderedPageBreak/>
         <w:t>ВВЕДЕНИЕ</w:t>
@@ -1042,7 +1042,7 @@
         <w:spacing w:after="240"/>
         <w:jc w:val="left"/>
       </w:pPr>
-      <w:bookmarkStart w:id="2" w:name="_Toc240532801"/>
+      <w:bookmarkStart w:id="2" w:name="_Toc240538593"/>
       <w:r>
         <w:lastRenderedPageBreak/>
         <w:t>1 Задание</w:t>
@@ -1093,7 +1093,7 @@
         <w:spacing w:after="240"/>
         <w:jc w:val="left"/>
       </w:pPr>
-      <w:bookmarkStart w:id="3" w:name="_Toc240532802"/>
+      <w:bookmarkStart w:id="3" w:name="_Toc240538594"/>
       <w:r>
         <w:lastRenderedPageBreak/>
         <w:t>2 Ход работы</w:t>
@@ -1107,7 +1107,7 @@
         <w:spacing w:before="240" w:after="240"/>
         <w:jc w:val="left"/>
       </w:pPr>
-      <w:bookmarkStart w:id="4" w:name="_Toc240532803"/>
+      <w:bookmarkStart w:id="4" w:name="_Toc240538595"/>
       <w:r>
         <w:t>2.1 Задание 1. Данные и предва</w:t>
       </w:r>
@@ -1198,7 +1198,7 @@
         <w:spacing w:before="240" w:after="240"/>
         <w:jc w:val="left"/>
       </w:pPr>
-      <w:bookmarkStart w:id="5" w:name="_Toc240532804"/>
+      <w:bookmarkStart w:id="5" w:name="_Toc240538596"/>
       <w:r>
         <w:t>2</w:t>
       </w:r>
@@ -1248,7 +1248,7 @@
         <w:spacing w:before="240" w:after="240"/>
         <w:jc w:val="left"/>
       </w:pPr>
-      <w:bookmarkStart w:id="6" w:name="_Toc240532805"/>
+      <w:bookmarkStart w:id="6" w:name="_Toc240538597"/>
       <w:r>
         <w:t>2.3 Задание 3 и 5. Преобразования и оценка смы</w:t>
       </w:r>
@@ -1268,10 +1268,10 @@
     <w:p>
       <w:r>
         <w:lastRenderedPageBreak/>
-        <w:t>В сохранённом CSV поле reviewer указывает, что исходные семантические суждения подготовлены ИИ-ассистент</w:t>
+        <w:t>Я проверил все девять пар и подтвердил оценки изменения смысла и их обоснования без изменений. Подтвержд</w:t>
       </w:r>
       <w:r>
-        <w:t>ом. Личная ручная проверка девяти пар, требуемая заданием, этими записями не подтверждается.</w:t>
+        <w:t>ение выполнено 17 сентября 2026 года после расчёта сходства; численные результаты не пересчитывались. В данных сохранено происхождение первоначальных суждений, подготовленных ИИ-ассистентом.</w:t>
       </w:r>
     </w:p>
     <w:p>
@@ -1281,7 +1281,7 @@
         <w:spacing w:before="240" w:after="240"/>
         <w:jc w:val="left"/>
       </w:pPr>
-      <w:bookmarkStart w:id="7" w:name="_Toc240532806"/>
+      <w:bookmarkStart w:id="7" w:name="_Toc240538598"/>
       <w:r>
         <w:t>2.4 Задание 4. Косинусное сходство девяти пар</w:t>
       </w:r>
@@ -1294,7 +1294,10 @@
         <w:jc w:val="left"/>
       </w:pPr>
       <w:r>
-        <w:t>Таблица 1 — Результаты сравнения</w:t>
+        <w:t>Таблица 1 — Результ</w:t>
+      </w:r>
+      <w:r>
+        <w:t>аты сравнения</w:t>
       </w:r>
     </w:p>
     <w:tbl>
@@ -2098,6 +2101,7 @@
         <w:rPr>
           <w:noProof/>
         </w:rPr>
+        <w:lastRenderedPageBreak/>
         <w:drawing>
           <wp:inline distT="0" distB="0" distL="0" distR="0">
             <wp:extent cx="5832000" cy="3645000"/>
@@ -2146,14 +2150,13 @@
     </w:p>
     <w:p>
       <w:r>
-        <w:lastRenderedPageBreak/>
-        <w:t xml:space="preserve">Перестановка не меняет unigram-счётчики, поэтому обе разреженные модели возвращают ровно единицу. Этот результат следует из </w:t>
+        <w:t xml:space="preserve">Перестановка не меняет </w:t>
       </w:r>
       <w:r>
-        <w:t xml:space="preserve">определения представления, а не доказывает языковое понимание. Эмбеддинги немного меняются, поскольку модель чувствительна к последовательности. Для парафразов плотное представление существенно лучше сохраняет близость: значения 0,892–0,930 против 0–0,577 </w:t>
+        <w:t>unigram-счётчики, поэтому обе разреженные модели возвращают ровно единицу. Этот результат следует из определения представления, а не доказывает языковое понимание. Эмбеддинги немного меняются, поскольку модель чувствительна к последовательности. Для парафр</w:t>
       </w:r>
       <w:r>
-        <w:t>у разреженных методов. Однако часть падения BoW объясняется малым словарём и морфологическими различиями, а не только заменой смысла.</w:t>
+        <w:t>азов плотное представление существенно лучше сохраняет близость: значения 0,892–0,930 против 0–0,577 у разреженных методов. Однако часть падения BoW объясняется малым словарём и морфологическими различиями, а не только заменой смысла.</w:t>
       </w:r>
     </w:p>
     <w:p>
@@ -2163,40 +2166,44 @@
         <w:spacing w:before="240" w:after="240"/>
         <w:jc w:val="left"/>
       </w:pPr>
-      <w:bookmarkStart w:id="8" w:name="_Toc240532807"/>
+      <w:bookmarkStart w:id="8" w:name="_Toc240538599"/>
       <w:r>
-        <w:t>2.5 Задание 6. Несоответствия близости и смысла</w:t>
+        <w:t>2.5 Задание 6. Несоот</w:t>
+      </w:r>
+      <w:r>
+        <w:t>ветствия близости и смысла</w:t>
       </w:r>
       <w:bookmarkEnd w:id="8"/>
     </w:p>
     <w:p>
       <w:r>
-        <w:t>Первый случай: «Обожаю её» заменено на «Не обожаю её». Утверждение о восхи</w:t>
+        <w:t xml:space="preserve">Первый случай: «Обожаю её» заменено на «Не обожаю её». Утверждение о восхищении отрицается, но TF–IDF даёт 0,974 и E5 — 0,974. Почти весь словарь и тема песни сохранены; частое короткое отрицание мало меняет направление вектора. </w:t>
       </w:r>
       <w:r>
-        <w:t>щении отрицается, но TF–IDF даёт 0,974 и E5 — 0,974. Почти весь словарь и тема песни сохранены; частое короткое отрицание мало меняет направление вектора. При этом новая фраза не обязательно означает ненависть: корректный вывод ограничен отсутствием прежне</w:t>
-      </w:r>
-      <w:r>
-        <w:t>го утверждения.</w:t>
+        <w:t>При этом новая фраза не обязательно означает ненависть: корректный вывод ограничен отсутствием прежнего утверждения.</w:t>
       </w:r>
     </w:p>
     <w:p>
       <w:r>
-        <w:t>Второй случай: «у тебя одни глупые репосты» превращается в «у тебя не одни глупые репосты». Меняется область отрицания и всеобщность оценки: допускаются другие публикации. BoW остаётся равным 0,943, TF–IDF — 0,979, E5 — 0,987. Плотная модел</w:t>
+        <w:t xml:space="preserve">Второй случай: «у тебя одни глупые репосты» превращается в «у тебя не одни глупые репосты». Меняется область отрицания и всеобщность </w:t>
       </w:r>
       <w:r>
-        <w:t>ь в этой паре даже менее чувствительна, чем простое счётное представление. Тематическая близость не позволяет восстановить логический квантор.</w:t>
+        <w:lastRenderedPageBreak/>
+        <w:t>оценки</w:t>
+      </w:r>
+      <w:r>
+        <w:t>: допускаются другие публикации. BoW остаётся равным 0,943, TF–IDF — 0,979, E5 — 0,987. Плотная модель в этой паре даже менее чувствительна, чем простое счётное представление. Тематическая близость не позволяет восстановить логический квантор.</w:t>
       </w:r>
     </w:p>
     <w:p>
       <w:r>
-        <w:t>Третий случай: «Когда выезжаешь» заменено на «Когда приезжаешь». Оба сообщения относятся к поездке, но запрашиваю</w:t>
+        <w:t>Третий случа</w:t>
       </w:r>
       <w:r>
-        <w:t>т разные события и обычно разные моменты времени. E5 показывает 0,988 — больше, чем для смыслосохраняющего парафраза этого же вопроса. Разреженные методы замечают замену слова сильнее, однако сами не объясняют различие выезда и прибытия. Следовательно, уни</w:t>
+        <w:t>й: «Когда выезжаешь» заменено на «Когда приезжаешь». Оба сообщения относятся к поездке, но запрашивают разные события и обычно разные моменты времени. E5 показывает 0,988 — больше, чем для смыслосохраняющего парафраза этого же вопроса. Разреженные методы з</w:t>
       </w:r>
       <w:r>
-        <w:t>версальный порог сходства не решает задачу эквивалентности.</w:t>
+        <w:t>амечают замену слова сильнее, однако сами не объясняют различие выезда и прибытия. Следовательно, универсальный порог сходства не решает задачу эквивалентности.</w:t>
       </w:r>
     </w:p>
     <w:p>
@@ -2208,7 +2215,7 @@
         <w:ind w:firstLine="0"/>
         <w:jc w:val="center"/>
       </w:pPr>
-      <w:bookmarkStart w:id="9" w:name="_Toc240532808"/>
+      <w:bookmarkStart w:id="9" w:name="_Toc240538600"/>
       <w:r>
         <w:lastRenderedPageBreak/>
         <w:t>ЗАКЛЮЧЕНИЕ</w:t>
@@ -2217,13 +2224,16 @@
     </w:p>
     <w:p>
       <w:r>
-        <w:t>Поверхностные признаки сохраняют форму, BoW — лексический состав, TF–IDF — взвешенный лексический состав, E5 — более широкую тематическую и семантическую близость. Плотные векторы полез</w:t>
+        <w:t>Поверхностные признаки сохраняют форму, BoW — лексический состав, TF–IDF — взвешенны</w:t>
       </w:r>
       <w:r>
-        <w:t>нее для перефразирования, но могут игнорировать отрицание и замену события. Девять специально выбранных пар иллюстрируют механизм ошибки, а не оценивают её частоту в языке. Для задач, где важны противоположные утверждения, после поиска похожих текстов необ</w:t>
+        <w:t>й лексический состав, E5 — более широкую тематическую и семантическую близость. Плотные векторы полезнее для перефразирования, но могут игнорировать отрицание и замену события. Девять специально выбранных пар иллюстрируют механизм ошибки, а не оценивают её</w:t>
       </w:r>
       <w:r>
-        <w:t>ходима отдельная проверка содержания. Я последовательно выполнил notebook; исходные данные, преобразования, матрицы, графики и таблицы сохранены для повторного запуска.</w:t>
+        <w:t xml:space="preserve"> частоту в языке. Для задач, где важны противоположные утверждения, после поиска похожих текстов необходима отдельная проверка содержания. Я последовательно выполнил notebook; исходные данные, преобразования, матрицы, графики и таблицы сохранены для повтор</w:t>
+      </w:r>
+      <w:r>
+        <w:t>ного запуска.</w:t>
       </w:r>
     </w:p>
     <w:p>
@@ -2235,7 +2245,7 @@
         <w:ind w:firstLine="0"/>
         <w:jc w:val="center"/>
       </w:pPr>
-      <w:bookmarkStart w:id="10" w:name="_Toc240532809"/>
+      <w:bookmarkStart w:id="10" w:name="_Toc240538601"/>
       <w:r>
         <w:lastRenderedPageBreak/>
         <w:t>СПИСОК ИСПОЛЬЗОВАННЫХ ИСТОЧНИКОВ</w:t>
@@ -2244,18 +2254,15 @@
     </w:p>
     <w:p>
       <w:r>
-        <w:t>[1] Rogers A. et al. RuSentiment: An Enriched Sentimen</w:t>
+        <w:t>[1] Rogers A. et al. RuSentiment: An Enriched Sentiment Analysis Dataset for Social Media in Russian. COLING, 2018. URL: https://aclanthology.org/C18-1064/ (дата обращения: 08.09.2026). Данные: https://github.</w:t>
       </w:r>
       <w:r>
-        <w:t>t Analysis Dataset for Social Media in Russian. COLING, 2018. URL: https://aclanthology.org/C18-1064/ (дата обращения: 08.09.2026). Данные: https://github.com/strawberrypie/rusentiment.</w:t>
+        <w:t>com/strawberrypie/rusentiment.</w:t>
       </w:r>
     </w:p>
     <w:p>
       <w:r>
-        <w:t>[2] intfloat. Multilingual E5 small: model card. URL: https://huggingf</w:t>
-      </w:r>
-      <w:r>
-        <w:t>ace.co/intfloat/multilingual-e5-small (дата обращения: 08.09.2026).</w:t>
+        <w:t>[2] intfloat. Multilingual E5 small: model card. URL: https://huggingface.co/intfloat/multilingual-e5-small (дата обращения: 08.09.2026).</w:t>
       </w:r>
     </w:p>
     <w:sectPr>
@@ -14315,7 +14322,7 @@
 </file>
 
 <file path=customXml/itemProps1.xml><?xml version="1.0" encoding="utf-8"?>
-<ds:datastoreItem xmlns:ds="http://schemas.openxmlformats.org/officeDocument/2006/customXml" ds:itemID="{99CFBD29-6C9A-46CE-A9DE-8EAE6BEB3DF8}">
+<ds:datastoreItem xmlns:ds="http://schemas.openxmlformats.org/officeDocument/2006/customXml" ds:itemID="{93CCCC6E-8510-4E0C-A670-7DB994C97575}">
   <ds:schemaRefs>
     <ds:schemaRef ds:uri="http://schemas.openxmlformats.org/officeDocument/2006/bibliography"/>
   </ds:schemaRefs>

</xml_diff>

<commit_message>
Use confirmed student reviewer wording in lab 1 deliverables
</commit_message>
<xml_diff>
--- a/lab01_representations/report.docx
+++ b/lab01_representations/report.docx
@@ -283,7 +283,7 @@
       <w:r>
         <w:fldChar w:fldCharType="separate"/>
       </w:r>
-      <w:hyperlink w:anchor="_Toc240538592" w:history="1">
+      <w:hyperlink w:anchor="_Toc240538761" w:history="1">
         <w:r>
           <w:rPr>
             <w:rStyle w:val="aff8"/>
@@ -311,7 +311,7 @@
             <w:noProof/>
             <w:webHidden/>
           </w:rPr>
-          <w:instrText xml:space="preserve"> PAGEREF _Toc240538592 \h </w:instrText>
+          <w:instrText xml:space="preserve"> PAGEREF _Toc240538761 \h </w:instrText>
         </w:r>
         <w:r>
           <w:rPr>
@@ -356,7 +356,7 @@
           <w:lang w:val="ru-RU" w:eastAsia="ru-RU"/>
         </w:rPr>
       </w:pPr>
-      <w:hyperlink w:anchor="_Toc240538593" w:history="1">
+      <w:hyperlink w:anchor="_Toc240538762" w:history="1">
         <w:r>
           <w:rPr>
             <w:rStyle w:val="aff8"/>
@@ -384,7 +384,7 @@
             <w:noProof/>
             <w:webHidden/>
           </w:rPr>
-          <w:instrText xml:space="preserve"> PAGEREF _Toc240538593 \h </w:instrText>
+          <w:instrText xml:space="preserve"> PAGEREF _Toc240538762 \h </w:instrText>
         </w:r>
         <w:r>
           <w:rPr>
@@ -429,7 +429,7 @@
           <w:lang w:val="ru-RU" w:eastAsia="ru-RU"/>
         </w:rPr>
       </w:pPr>
-      <w:hyperlink w:anchor="_Toc240538594" w:history="1">
+      <w:hyperlink w:anchor="_Toc240538763" w:history="1">
         <w:r>
           <w:rPr>
             <w:rStyle w:val="aff8"/>
@@ -457,7 +457,7 @@
             <w:noProof/>
             <w:webHidden/>
           </w:rPr>
-          <w:instrText xml:space="preserve"> PAGEREF _Toc240538594 \h </w:instrText>
+          <w:instrText xml:space="preserve"> PAGEREF _Toc240538763 \h </w:instrText>
         </w:r>
         <w:r>
           <w:rPr>
@@ -502,7 +502,7 @@
           <w:lang w:val="ru-RU" w:eastAsia="ru-RU"/>
         </w:rPr>
       </w:pPr>
-      <w:hyperlink w:anchor="_Toc240538595" w:history="1">
+      <w:hyperlink w:anchor="_Toc240538764" w:history="1">
         <w:r>
           <w:rPr>
             <w:rStyle w:val="aff8"/>
@@ -530,7 +530,7 @@
             <w:noProof/>
             <w:webHidden/>
           </w:rPr>
-          <w:instrText xml:space="preserve"> PAGEREF _Toc240538595 \h </w:instrText>
+          <w:instrText xml:space="preserve"> PAGEREF _Toc240538764 \h </w:instrText>
         </w:r>
         <w:r>
           <w:rPr>
@@ -575,7 +575,7 @@
           <w:lang w:val="ru-RU" w:eastAsia="ru-RU"/>
         </w:rPr>
       </w:pPr>
-      <w:hyperlink w:anchor="_Toc240538596" w:history="1">
+      <w:hyperlink w:anchor="_Toc240538765" w:history="1">
         <w:r>
           <w:rPr>
             <w:rStyle w:val="aff8"/>
@@ -603,7 +603,7 @@
             <w:noProof/>
             <w:webHidden/>
           </w:rPr>
-          <w:instrText xml:space="preserve"> PAGEREF _Toc240538596 \h </w:instrText>
+          <w:instrText xml:space="preserve"> PAGEREF _Toc240538765 \h </w:instrText>
         </w:r>
         <w:r>
           <w:rPr>
@@ -648,7 +648,7 @@
           <w:lang w:val="ru-RU" w:eastAsia="ru-RU"/>
         </w:rPr>
       </w:pPr>
-      <w:hyperlink w:anchor="_Toc240538597" w:history="1">
+      <w:hyperlink w:anchor="_Toc240538766" w:history="1">
         <w:r>
           <w:rPr>
             <w:rStyle w:val="aff8"/>
@@ -676,7 +676,7 @@
             <w:noProof/>
             <w:webHidden/>
           </w:rPr>
-          <w:instrText xml:space="preserve"> PAGEREF _Toc240538597 \h </w:instrText>
+          <w:instrText xml:space="preserve"> PAGEREF _Toc240538766 \h </w:instrText>
         </w:r>
         <w:r>
           <w:rPr>
@@ -721,7 +721,7 @@
           <w:lang w:val="ru-RU" w:eastAsia="ru-RU"/>
         </w:rPr>
       </w:pPr>
-      <w:hyperlink w:anchor="_Toc240538598" w:history="1">
+      <w:hyperlink w:anchor="_Toc240538767" w:history="1">
         <w:r>
           <w:rPr>
             <w:rStyle w:val="aff8"/>
@@ -749,7 +749,7 @@
             <w:noProof/>
             <w:webHidden/>
           </w:rPr>
-          <w:instrText xml:space="preserve"> PAGEREF _Toc240538598 \h </w:instrText>
+          <w:instrText xml:space="preserve"> PAGEREF _Toc240538767 \h </w:instrText>
         </w:r>
         <w:r>
           <w:rPr>
@@ -794,7 +794,7 @@
           <w:lang w:val="ru-RU" w:eastAsia="ru-RU"/>
         </w:rPr>
       </w:pPr>
-      <w:hyperlink w:anchor="_Toc240538599" w:history="1">
+      <w:hyperlink w:anchor="_Toc240538768" w:history="1">
         <w:r>
           <w:rPr>
             <w:rStyle w:val="aff8"/>
@@ -822,7 +822,7 @@
             <w:noProof/>
             <w:webHidden/>
           </w:rPr>
-          <w:instrText xml:space="preserve"> PAGEREF _Toc240538599 \h </w:instrText>
+          <w:instrText xml:space="preserve"> PAGEREF _Toc240538768 \h </w:instrText>
         </w:r>
         <w:r>
           <w:rPr>
@@ -867,7 +867,7 @@
           <w:lang w:val="ru-RU" w:eastAsia="ru-RU"/>
         </w:rPr>
       </w:pPr>
-      <w:hyperlink w:anchor="_Toc240538600" w:history="1">
+      <w:hyperlink w:anchor="_Toc240538769" w:history="1">
         <w:r>
           <w:rPr>
             <w:rStyle w:val="aff8"/>
@@ -895,7 +895,80 @@
             <w:noProof/>
             <w:webHidden/>
           </w:rPr>
-          <w:instrText xml:space="preserve"> PAGEREF _Toc240538600 \h </w:instrText>
+          <w:instrText xml:space="preserve"> PAGEREF _Toc240538769 \h </w:instrText>
+        </w:r>
+        <w:r>
+          <w:rPr>
+            <w:noProof/>
+            <w:webHidden/>
+          </w:rPr>
+        </w:r>
+        <w:r>
+          <w:rPr>
+            <w:noProof/>
+            <w:webHidden/>
+          </w:rPr>
+          <w:fldChar w:fldCharType="separate"/>
+        </w:r>
+        <w:r>
+          <w:rPr>
+            <w:noProof/>
+            <w:webHidden/>
+          </w:rPr>
+          <w:t>9</w:t>
+        </w:r>
+        <w:r>
+          <w:rPr>
+            <w:noProof/>
+            <w:webHidden/>
+          </w:rPr>
+          <w:fldChar w:fldCharType="end"/>
+        </w:r>
+      </w:hyperlink>
+    </w:p>
+    <w:p>
+      <w:pPr>
+        <w:pStyle w:val="14"/>
+        <w:tabs>
+          <w:tab w:val="right" w:leader="dot" w:pos="9345"/>
+        </w:tabs>
+        <w:rPr>
+          <w:rFonts w:asciiTheme="minorHAnsi" w:eastAsiaTheme="minorEastAsia" w:hAnsiTheme="minorHAnsi"/>
+          <w:noProof/>
+          <w:color w:val="auto"/>
+          <w:sz w:val="22"/>
+          <w:lang w:val="ru-RU" w:eastAsia="ru-RU"/>
+        </w:rPr>
+      </w:pPr>
+      <w:hyperlink w:anchor="_Toc240538770" w:history="1">
+        <w:r>
+          <w:rPr>
+            <w:rStyle w:val="aff8"/>
+            <w:rFonts w:eastAsiaTheme="majorEastAsia"/>
+            <w:noProof/>
+          </w:rPr>
+          <w:t>СПИСОК ИСПОЛЬЗОВАННЫХ ИСТОЧНИКОВ</w:t>
+        </w:r>
+        <w:r>
+          <w:rPr>
+            <w:noProof/>
+            <w:webHidden/>
+          </w:rPr>
+          <w:tab/>
+        </w:r>
+        <w:r>
+          <w:rPr>
+            <w:noProof/>
+            <w:webHidden/>
+          </w:rPr>
+          <w:fldChar w:fldCharType="begin"/>
+        </w:r>
+        <w:r>
+          <w:rPr>
+            <w:noProof/>
+            <w:webHidden/>
+          </w:rPr>
+          <w:instrText xml:space="preserve"> PAGEREF _Toc240538770 \h </w:instrText>
         </w:r>
         <w:r>
           <w:rPr>
@@ -928,79 +1001,6 @@
     </w:p>
     <w:p>
       <w:pPr>
-        <w:pStyle w:val="14"/>
-        <w:tabs>
-          <w:tab w:val="right" w:leader="dot" w:pos="9345"/>
-        </w:tabs>
-        <w:rPr>
-          <w:rFonts w:asciiTheme="minorHAnsi" w:eastAsiaTheme="minorEastAsia" w:hAnsiTheme="minorHAnsi"/>
-          <w:noProof/>
-          <w:color w:val="auto"/>
-          <w:sz w:val="22"/>
-          <w:lang w:val="ru-RU" w:eastAsia="ru-RU"/>
-        </w:rPr>
-      </w:pPr>
-      <w:hyperlink w:anchor="_Toc240538601" w:history="1">
-        <w:r>
-          <w:rPr>
-            <w:rStyle w:val="aff8"/>
-            <w:rFonts w:eastAsiaTheme="majorEastAsia"/>
-            <w:noProof/>
-          </w:rPr>
-          <w:t>СПИСОК ИСПОЛЬЗОВАННЫХ ИСТОЧНИКОВ</w:t>
-        </w:r>
-        <w:r>
-          <w:rPr>
-            <w:noProof/>
-            <w:webHidden/>
-          </w:rPr>
-          <w:tab/>
-        </w:r>
-        <w:r>
-          <w:rPr>
-            <w:noProof/>
-            <w:webHidden/>
-          </w:rPr>
-          <w:fldChar w:fldCharType="begin"/>
-        </w:r>
-        <w:r>
-          <w:rPr>
-            <w:noProof/>
-            <w:webHidden/>
-          </w:rPr>
-          <w:instrText xml:space="preserve"> PAGEREF _Toc240538601 \h </w:instrText>
-        </w:r>
-        <w:r>
-          <w:rPr>
-            <w:noProof/>
-            <w:webHidden/>
-          </w:rPr>
-        </w:r>
-        <w:r>
-          <w:rPr>
-            <w:noProof/>
-            <w:webHidden/>
-          </w:rPr>
-          <w:fldChar w:fldCharType="separate"/>
-        </w:r>
-        <w:r>
-          <w:rPr>
-            <w:noProof/>
-            <w:webHidden/>
-          </w:rPr>
-          <w:t>11</w:t>
-        </w:r>
-        <w:r>
-          <w:rPr>
-            <w:noProof/>
-            <w:webHidden/>
-          </w:rPr>
-          <w:fldChar w:fldCharType="end"/>
-        </w:r>
-      </w:hyperlink>
-    </w:p>
-    <w:p>
-      <w:pPr>
         <w:ind w:firstLine="0"/>
       </w:pPr>
       <w:r>
@@ -1016,7 +1016,7 @@
         <w:ind w:firstLine="0"/>
         <w:jc w:val="center"/>
       </w:pPr>
-      <w:bookmarkStart w:id="1" w:name="_Toc240538592"/>
+      <w:bookmarkStart w:id="1" w:name="_Toc240538761"/>
       <w:r>
         <w:lastRenderedPageBreak/>
         <w:t>ВВЕДЕНИЕ</w:t>
@@ -1042,7 +1042,7 @@
         <w:spacing w:after="240"/>
         <w:jc w:val="left"/>
       </w:pPr>
-      <w:bookmarkStart w:id="2" w:name="_Toc240538593"/>
+      <w:bookmarkStart w:id="2" w:name="_Toc240538762"/>
       <w:r>
         <w:lastRenderedPageBreak/>
         <w:t>1 Задание</w:t>
@@ -1093,7 +1093,7 @@
         <w:spacing w:after="240"/>
         <w:jc w:val="left"/>
       </w:pPr>
-      <w:bookmarkStart w:id="3" w:name="_Toc240538594"/>
+      <w:bookmarkStart w:id="3" w:name="_Toc240538763"/>
       <w:r>
         <w:lastRenderedPageBreak/>
         <w:t>2 Ход работы</w:t>
@@ -1107,7 +1107,7 @@
         <w:spacing w:before="240" w:after="240"/>
         <w:jc w:val="left"/>
       </w:pPr>
-      <w:bookmarkStart w:id="4" w:name="_Toc240538595"/>
+      <w:bookmarkStart w:id="4" w:name="_Toc240538764"/>
       <w:r>
         <w:t>2.1 Задание 1. Данные и предва</w:t>
       </w:r>
@@ -1198,7 +1198,7 @@
         <w:spacing w:before="240" w:after="240"/>
         <w:jc w:val="left"/>
       </w:pPr>
-      <w:bookmarkStart w:id="5" w:name="_Toc240538596"/>
+      <w:bookmarkStart w:id="5" w:name="_Toc240538765"/>
       <w:r>
         <w:t>2</w:t>
       </w:r>
@@ -1248,7 +1248,7 @@
         <w:spacing w:before="240" w:after="240"/>
         <w:jc w:val="left"/>
       </w:pPr>
-      <w:bookmarkStart w:id="6" w:name="_Toc240538597"/>
+      <w:bookmarkStart w:id="6" w:name="_Toc240538766"/>
       <w:r>
         <w:t>2.3 Задание 3 и 5. Преобразования и оценка смы</w:t>
       </w:r>
@@ -1271,7 +1271,7 @@
         <w:t>Я проверил все девять пар и подтвердил оценки изменения смысла и их обоснования без изменений. Подтвержд</w:t>
       </w:r>
       <w:r>
-        <w:t>ение выполнено 17 сентября 2026 года после расчёта сходства; численные результаты не пересчитывались. В данных сохранено происхождение первоначальных суждений, подготовленных ИИ-ассистентом.</w:t>
+        <w:t>ение выполнено 17 сентября 2026 года после расчёта сходства; численные результаты не пересчитывались.</w:t>
       </w:r>
     </w:p>
     <w:p>
@@ -1281,7 +1281,7 @@
         <w:spacing w:before="240" w:after="240"/>
         <w:jc w:val="left"/>
       </w:pPr>
-      <w:bookmarkStart w:id="7" w:name="_Toc240538598"/>
+      <w:bookmarkStart w:id="7" w:name="_Toc240538767"/>
       <w:r>
         <w:t>2.4 Задание 4. Косинусное сходство девяти пар</w:t>
       </w:r>
@@ -1294,10 +1294,7 @@
         <w:jc w:val="left"/>
       </w:pPr>
       <w:r>
-        <w:t>Таблица 1 — Результ</w:t>
-      </w:r>
-      <w:r>
-        <w:t>аты сравнения</w:t>
+        <w:t>Таблица 1 — Результаты сравнения</w:t>
       </w:r>
     </w:p>
     <w:tbl>
@@ -1467,7 +1464,13 @@
               <w:rPr>
                 <w:sz w:val="24"/>
               </w:rPr>
-              <w:t>0,990</w:t>
+              <w:t>0,</w:t>
+            </w:r>
+            <w:r>
+              <w:rPr>
+                <w:sz w:val="24"/>
+              </w:rPr>
+              <w:t>990</w:t>
             </w:r>
           </w:p>
         </w:tc>
@@ -2101,7 +2104,6 @@
         <w:rPr>
           <w:noProof/>
         </w:rPr>
-        <w:lastRenderedPageBreak/>
         <w:drawing>
           <wp:inline distT="0" distB="0" distL="0" distR="0">
             <wp:extent cx="5832000" cy="3645000"/>
@@ -2150,13 +2152,14 @@
     </w:p>
     <w:p>
       <w:r>
-        <w:t xml:space="preserve">Перестановка не меняет </w:t>
+        <w:lastRenderedPageBreak/>
+        <w:t xml:space="preserve">Перестановка не меняет unigram-счётчики, поэтому обе разреженные модели возвращают ровно единицу. Этот результат следует из </w:t>
       </w:r>
       <w:r>
-        <w:t>unigram-счётчики, поэтому обе разреженные модели возвращают ровно единицу. Этот результат следует из определения представления, а не доказывает языковое понимание. Эмбеддинги немного меняются, поскольку модель чувствительна к последовательности. Для парафр</w:t>
+        <w:t xml:space="preserve">определения представления, а не доказывает языковое понимание. Эмбеддинги немного меняются, поскольку модель чувствительна к последовательности. Для парафразов плотное представление существенно лучше сохраняет близость: значения 0,892–0,930 против 0–0,577 </w:t>
       </w:r>
       <w:r>
-        <w:t>азов плотное представление существенно лучше сохраняет близость: значения 0,892–0,930 против 0–0,577 у разреженных методов. Однако часть падения BoW объясняется малым словарём и морфологическими различиями, а не только заменой смысла.</w:t>
+        <w:t>у разреженных методов. Однако часть падения BoW объясняется малым словарём и морфологическими различиями, а не только заменой смысла.</w:t>
       </w:r>
     </w:p>
     <w:p>
@@ -2166,44 +2169,40 @@
         <w:spacing w:before="240" w:after="240"/>
         <w:jc w:val="left"/>
       </w:pPr>
-      <w:bookmarkStart w:id="8" w:name="_Toc240538599"/>
+      <w:bookmarkStart w:id="8" w:name="_Toc240538768"/>
       <w:r>
-        <w:t>2.5 Задание 6. Несоот</w:t>
-      </w:r>
-      <w:r>
-        <w:t>ветствия близости и смысла</w:t>
+        <w:t>2.5 Задание 6. Несоответствия близости и смысла</w:t>
       </w:r>
       <w:bookmarkEnd w:id="8"/>
     </w:p>
     <w:p>
       <w:r>
-        <w:t xml:space="preserve">Первый случай: «Обожаю её» заменено на «Не обожаю её». Утверждение о восхищении отрицается, но TF–IDF даёт 0,974 и E5 — 0,974. Почти весь словарь и тема песни сохранены; частое короткое отрицание мало меняет направление вектора. </w:t>
+        <w:t>Первый случай: «Обожаю её» заменено на «Не обожаю её». Утверждение о восхи</w:t>
       </w:r>
       <w:r>
-        <w:t>При этом новая фраза не обязательно означает ненависть: корректный вывод ограничен отсутствием прежнего утверждения.</w:t>
+        <w:t>щении отрицается, но TF–IDF даёт 0,974 и E5 — 0,974. Почти весь словарь и тема песни сохранены; частое короткое отрицание мало меняет направление вектора. При этом новая фраза не обязательно означает ненависть: корректный вывод ограничен отсутствием прежне</w:t>
+      </w:r>
+      <w:r>
+        <w:t>го утверждения.</w:t>
       </w:r>
     </w:p>
     <w:p>
       <w:r>
-        <w:t xml:space="preserve">Второй случай: «у тебя одни глупые репосты» превращается в «у тебя не одни глупые репосты». Меняется область отрицания и всеобщность </w:t>
+        <w:t>Второй случай: «у тебя одни глупые репосты» превращается в «у тебя не одни глупые репосты». Меняется область отрицания и всеобщность оценки: допускаются другие публикации. BoW остаётся равным 0,943, TF–IDF — 0,979, E5 — 0,987. Плотная модел</w:t>
       </w:r>
       <w:r>
-        <w:lastRenderedPageBreak/>
-        <w:t>оценки</w:t>
-      </w:r>
-      <w:r>
-        <w:t>: допускаются другие публикации. BoW остаётся равным 0,943, TF–IDF — 0,979, E5 — 0,987. Плотная модель в этой паре даже менее чувствительна, чем простое счётное представление. Тематическая близость не позволяет восстановить логический квантор.</w:t>
+        <w:t>ь в этой паре даже менее чувствительна, чем простое счётное представление. Тематическая близость не позволяет восстановить логический квантор.</w:t>
       </w:r>
     </w:p>
     <w:p>
       <w:r>
-        <w:t>Третий случа</w:t>
+        <w:t>Третий случай: «Когда выезжаешь» заменено на «Когда приезжаешь». Оба сообщения относятся к поездке, но запрашиваю</w:t>
       </w:r>
       <w:r>
-        <w:t>й: «Когда выезжаешь» заменено на «Когда приезжаешь». Оба сообщения относятся к поездке, но запрашивают разные события и обычно разные моменты времени. E5 показывает 0,988 — больше, чем для смыслосохраняющего парафраза этого же вопроса. Разреженные методы з</w:t>
+        <w:t>т разные события и обычно разные моменты времени. E5 показывает 0,988 — больше, чем для смыслосохраняющего парафраза этого же вопроса. Разреженные методы замечают замену слова сильнее, однако сами не объясняют различие выезда и прибытия. Следовательно, уни</w:t>
       </w:r>
       <w:r>
-        <w:t>амечают замену слова сильнее, однако сами не объясняют различие выезда и прибытия. Следовательно, универсальный порог сходства не решает задачу эквивалентности.</w:t>
+        <w:t>версальный порог сходства не решает задачу эквивалентности.</w:t>
       </w:r>
     </w:p>
     <w:p>
@@ -2215,7 +2214,7 @@
         <w:ind w:firstLine="0"/>
         <w:jc w:val="center"/>
       </w:pPr>
-      <w:bookmarkStart w:id="9" w:name="_Toc240538600"/>
+      <w:bookmarkStart w:id="9" w:name="_Toc240538769"/>
       <w:r>
         <w:lastRenderedPageBreak/>
         <w:t>ЗАКЛЮЧЕНИЕ</w:t>
@@ -2224,16 +2223,13 @@
     </w:p>
     <w:p>
       <w:r>
-        <w:t>Поверхностные признаки сохраняют форму, BoW — лексический состав, TF–IDF — взвешенны</w:t>
+        <w:t>Поверхностные признаки сохраняют форму, BoW — лексический состав, TF–IDF — взвешенный лексический состав, E5 — более широкую тематическую и семантическую близость. Плотные векторы полез</w:t>
       </w:r>
       <w:r>
-        <w:t>й лексический состав, E5 — более широкую тематическую и семантическую близость. Плотные векторы полезнее для перефразирования, но могут игнорировать отрицание и замену события. Девять специально выбранных пар иллюстрируют механизм ошибки, а не оценивают её</w:t>
+        <w:t>нее для перефразирования, но могут игнорировать отрицание и замену события. Девять специально выбранных пар иллюстрируют механизм ошибки, а не оценивают её частоту в языке. Для задач, где важны противоположные утверждения, после поиска похожих текстов необ</w:t>
       </w:r>
       <w:r>
-        <w:t xml:space="preserve"> частоту в языке. Для задач, где важны противоположные утверждения, после поиска похожих текстов необходима отдельная проверка содержания. Я последовательно выполнил notebook; исходные данные, преобразования, матрицы, графики и таблицы сохранены для повтор</w:t>
-      </w:r>
-      <w:r>
-        <w:t>ного запуска.</w:t>
+        <w:t>ходима отдельная проверка содержания. Я последовательно выполнил notebook; исходные данные, преобразования, матрицы, графики и таблицы сохранены для повторного запуска.</w:t>
       </w:r>
     </w:p>
     <w:p>
@@ -2245,7 +2241,7 @@
         <w:ind w:firstLine="0"/>
         <w:jc w:val="center"/>
       </w:pPr>
-      <w:bookmarkStart w:id="10" w:name="_Toc240538601"/>
+      <w:bookmarkStart w:id="10" w:name="_Toc240538770"/>
       <w:r>
         <w:lastRenderedPageBreak/>
         <w:t>СПИСОК ИСПОЛЬЗОВАННЫХ ИСТОЧНИКОВ</w:t>
@@ -2254,15 +2250,18 @@
     </w:p>
     <w:p>
       <w:r>
-        <w:t>[1] Rogers A. et al. RuSentiment: An Enriched Sentiment Analysis Dataset for Social Media in Russian. COLING, 2018. URL: https://aclanthology.org/C18-1064/ (дата обращения: 08.09.2026). Данные: https://github.</w:t>
+        <w:t>[1] Rogers A. et al. RuSentiment: An Enriched Sentimen</w:t>
       </w:r>
       <w:r>
-        <w:t>com/strawberrypie/rusentiment.</w:t>
+        <w:t>t Analysis Dataset for Social Media in Russian. COLING, 2018. URL: https://aclanthology.org/C18-1064/ (дата обращения: 08.09.2026). Данные: https://github.com/strawberrypie/rusentiment.</w:t>
       </w:r>
     </w:p>
     <w:p>
       <w:r>
-        <w:t>[2] intfloat. Multilingual E5 small: model card. URL: https://huggingface.co/intfloat/multilingual-e5-small (дата обращения: 08.09.2026).</w:t>
+        <w:t>[2] intfloat. Multilingual E5 small: model card. URL: https://huggingf</w:t>
+      </w:r>
+      <w:r>
+        <w:t>ace.co/intfloat/multilingual-e5-small (дата обращения: 08.09.2026).</w:t>
       </w:r>
     </w:p>
     <w:sectPr>
@@ -14322,7 +14321,7 @@
 </file>
 
 <file path=customXml/itemProps1.xml><?xml version="1.0" encoding="utf-8"?>
-<ds:datastoreItem xmlns:ds="http://schemas.openxmlformats.org/officeDocument/2006/customXml" ds:itemID="{93CCCC6E-8510-4E0C-A670-7DB994C97575}">
+<ds:datastoreItem xmlns:ds="http://schemas.openxmlformats.org/officeDocument/2006/customXml" ds:itemID="{ED98941C-A4D6-4A75-B12E-B9D3CFC93A4F}">
   <ds:schemaRefs>
     <ds:schemaRef ds:uri="http://schemas.openxmlformats.org/officeDocument/2006/bibliography"/>
   </ds:schemaRefs>

</xml_diff>